<commit_message>
Automata terv-mentes (2026. 05. 29. 12:00:00,35)
</commit_message>
<xml_diff>
--- a/StreamTrack_DB_terv.docx
+++ b/StreamTrack_DB_terv.docx
@@ -59,21 +59,6 @@
           <w:rFonts w:hint="default"/>
           <w:lang w:val="hu-HU"/>
         </w:rPr>
-        <w:t>Platform szoveg,</w:t>
-      </w:r>
-    </w:p>
-    <w:p>
-      <w:pPr>
-        <w:rPr>
-          <w:rFonts w:hint="default"/>
-          <w:lang w:val="hu-HU"/>
-        </w:rPr>
-      </w:pPr>
-      <w:r>
-        <w:rPr>
-          <w:rFonts w:hint="default"/>
-          <w:lang w:val="hu-HU"/>
-        </w:rPr>
         <w:t>Hossz egész,</w:t>
       </w:r>
     </w:p>
@@ -348,7 +333,66 @@
           <w:lang w:val="hu-HU"/>
         </w:rPr>
       </w:pPr>
-      <w:bookmarkStart w:id="0" w:name="_GoBack"/>
+      <w:r>
+        <w:rPr>
+          <w:rFonts w:hint="default"/>
+          <w:lang w:val="hu-HU"/>
+        </w:rPr>
+        <w:t>StreamingPLatform:</w:t>
+      </w:r>
+    </w:p>
+    <w:p>
+      <w:pPr>
+        <w:rPr>
+          <w:rFonts w:hint="default"/>
+          <w:lang w:val="hu-HU"/>
+        </w:rPr>
+      </w:pPr>
+      <w:r>
+        <w:rPr>
+          <w:rFonts w:hint="default"/>
+          <w:lang w:val="hu-HU"/>
+        </w:rPr>
+        <w:t>Id egész,</w:t>
+      </w:r>
+    </w:p>
+    <w:p>
+      <w:pPr>
+        <w:rPr>
+          <w:rFonts w:hint="default"/>
+          <w:lang w:val="hu-HU"/>
+        </w:rPr>
+      </w:pPr>
+      <w:r>
+        <w:rPr>
+          <w:rFonts w:hint="default"/>
+          <w:lang w:val="hu-HU"/>
+        </w:rPr>
+        <w:t>Név szöveg,</w:t>
+      </w:r>
+    </w:p>
+    <w:p>
+      <w:pPr>
+        <w:rPr>
+          <w:rFonts w:hint="default"/>
+          <w:lang w:val="hu-HU"/>
+        </w:rPr>
+      </w:pPr>
+      <w:r>
+        <w:rPr>
+          <w:rFonts w:hint="default"/>
+          <w:lang w:val="hu-HU"/>
+        </w:rPr>
+        <w:t>LogoUrl szöveg (blob)</w:t>
+      </w:r>
+    </w:p>
+    <w:p>
+      <w:pPr>
+        <w:rPr>
+          <w:rFonts w:hint="default"/>
+          <w:lang w:val="hu-HU"/>
+        </w:rPr>
+      </w:pPr>
       <w:r>
         <w:rPr>
           <w:rFonts w:hint="default"/>
@@ -356,8 +400,8 @@
         </w:rPr>
         <w:drawing>
           <wp:inline distT="0" distB="0" distL="114300" distR="114300">
-            <wp:extent cx="5274310" cy="3407410"/>
-            <wp:effectExtent l="0" t="0" r="8890" b="8890"/>
+            <wp:extent cx="5273040" cy="3402330"/>
+            <wp:effectExtent l="0" t="0" r="10160" b="1270"/>
             <wp:docPr id="1" name="Picture 1" descr="StreamTrack_EK.drawio"/>
             <wp:cNvGraphicFramePr>
               <a:graphicFrameLocks xmlns:a="http://schemas.openxmlformats.org/drawingml/2006/main" noChangeAspect="1"/>
@@ -380,7 +424,7 @@
                   <pic:spPr>
                     <a:xfrm>
                       <a:off x="0" y="0"/>
-                      <a:ext cx="5274310" cy="3407410"/>
+                      <a:ext cx="5273040" cy="3402330"/>
                     </a:xfrm>
                     <a:prstGeom prst="rect">
                       <a:avLst/>
@@ -392,6 +436,7 @@
           </wp:inline>
         </w:drawing>
       </w:r>
+      <w:bookmarkStart w:id="0" w:name="_GoBack"/>
       <w:bookmarkEnd w:id="0"/>
     </w:p>
     <w:sectPr>
@@ -409,7 +454,7 @@
   <w:docDefaults>
     <w:rPrDefault>
       <w:rPr>
-        <w:rFonts w:asciiTheme="minorHAnsi" w:hAnsiTheme="minorHAnsi" w:eastAsiaTheme="minorEastAsia" w:cstheme="minorBidi"/>
+        <w:rFonts w:ascii="Times New Roman" w:hAnsi="Times New Roman" w:eastAsia="SimSun" w:cs="Times New Roman"/>
       </w:rPr>
     </w:rPrDefault>
     <w:pPrDefault/>
@@ -480,7 +525,7 @@
     <w:lsdException w:qFormat="1" w:unhideWhenUsed="0" w:uiPriority="0" w:semiHidden="0" w:name="Title"/>
     <w:lsdException w:unhideWhenUsed="0" w:uiPriority="0" w:semiHidden="0" w:name="Closing"/>
     <w:lsdException w:unhideWhenUsed="0" w:uiPriority="0" w:semiHidden="0" w:name="Signature"/>
-    <w:lsdException w:unhideWhenUsed="0" w:uiPriority="0" w:name="Default Paragraph Font"/>
+    <w:lsdException w:qFormat="1" w:unhideWhenUsed="0" w:uiPriority="0" w:name="Default Paragraph Font"/>
     <w:lsdException w:unhideWhenUsed="0" w:uiPriority="0" w:semiHidden="0" w:name="Body Text"/>
     <w:lsdException w:unhideWhenUsed="0" w:uiPriority="0" w:semiHidden="0" w:name="Body Text Indent"/>
     <w:lsdException w:unhideWhenUsed="0" w:uiPriority="0" w:semiHidden="0" w:name="List Continue"/>
@@ -518,7 +563,7 @@
     <w:lsdException w:unhideWhenUsed="0" w:uiPriority="0" w:semiHidden="0" w:name="HTML Sample"/>
     <w:lsdException w:unhideWhenUsed="0" w:uiPriority="0" w:semiHidden="0" w:name="HTML Typewriter"/>
     <w:lsdException w:unhideWhenUsed="0" w:uiPriority="0" w:semiHidden="0" w:name="HTML Variable"/>
-    <w:lsdException w:unhideWhenUsed="0" w:uiPriority="0" w:name="Normal Table"/>
+    <w:lsdException w:qFormat="1" w:unhideWhenUsed="0" w:uiPriority="0" w:name="Normal Table"/>
     <w:lsdException w:unhideWhenUsed="0" w:uiPriority="0" w:semiHidden="0" w:name="annotation subject"/>
     <w:lsdException w:unhideWhenUsed="0" w:uiPriority="0" w:semiHidden="0" w:name="Table Simple 1"/>
     <w:lsdException w:unhideWhenUsed="0" w:uiPriority="0" w:semiHidden="0" w:name="Table Simple 2"/>
@@ -676,11 +721,13 @@
   <w:style w:type="character" w:default="1" w:styleId="2">
     <w:name w:val="Default Paragraph Font"/>
     <w:semiHidden/>
+    <w:qFormat/>
     <w:uiPriority w:val="0"/>
   </w:style>
   <w:style w:type="table" w:default="1" w:styleId="3">
     <w:name w:val="Normal Table"/>
     <w:semiHidden/>
+    <w:qFormat/>
     <w:uiPriority w:val="0"/>
     <w:tblPr>
       <w:tblCellMar>

</xml_diff>

<commit_message>
Automata terv-mentes (2026. 05. 29. 12:19:10,35)
</commit_message>
<xml_diff>
--- a/StreamTrack_DB_terv.docx
+++ b/StreamTrack_DB_terv.docx
@@ -91,21 +91,8 @@
         </w:rPr>
         <w:t>Rész egész,</w:t>
       </w:r>
-    </w:p>
-    <w:p>
-      <w:pPr>
-        <w:rPr>
-          <w:rFonts w:hint="default"/>
-          <w:lang w:val="hu-HU"/>
-        </w:rPr>
-      </w:pPr>
-      <w:r>
-        <w:rPr>
-          <w:rFonts w:hint="default"/>
-          <w:lang w:val="hu-HU"/>
-        </w:rPr>
-        <w:t>Mufaj szöveg,</w:t>
-      </w:r>
+      <w:bookmarkStart w:id="0" w:name="_GoBack"/>
+      <w:bookmarkEnd w:id="0"/>
     </w:p>
     <w:p>
       <w:pPr>
@@ -436,8 +423,6 @@
           </wp:inline>
         </w:drawing>
       </w:r>
-      <w:bookmarkStart w:id="0" w:name="_GoBack"/>
-      <w:bookmarkEnd w:id="0"/>
     </w:p>
     <w:sectPr>
       <w:pgSz w:w="11906" w:h="16838"/>

</xml_diff>